<commit_message>
Regla 7 parejas de guías (fija) + limpieza de datos viejos en docs de trabajo
- Regla del director: 7 parejas de guías (14) es FIJO; lo que varía es el # de
  participantes por grupo. Encodeada en estado.json (reglas.parejas_guias) y corregida
  en la Guía de Guías (3 menciones). Retracté la sugerencia errónea de 'agregar 2 guías'.
- Limpieza de stale en docs de trabajo: veterano→experimentado (ANALISIS), Fabelle→Fabelly
  y Soriank→Soriano (ARCO, RESUMEN, SEGUIMIENTO), 21 cocina→20+1 vacante y 1–2 La Vega→1
  (RESUMEN), ~48 participantes→100 en casa (PROMPT_CLAUDE_DESIGN).
- AUDITORIA_SESION: histórico, se deja como registro (superado por verify + TRAZABILIDAD).
TODO PASS.

https://claude.ai/code/session_016scja59CycFFrqKgYsUPWh
</commit_message>
<xml_diff>
--- a/Carpeta_F1_ETC88.docx
+++ b/Carpeta_F1_ETC88.docx
@@ -486,7 +486,7 @@
           </w:tcPr>
           <w:p>
             <w:r>
-              <w:t>Reunión de Coordinadores — jue 4-jun (Corpus Christi, virtual) o dom 7-jun (pre-misa)</w:t>
+              <w:t>Reunión de Coordinadores (jueves 4-jun · Corpus Christi · virtual)</w:t>
             </w:r>
           </w:p>
         </w:tc>
@@ -845,6 +845,34 @@
           </w:p>
         </w:tc>
       </w:tr>
+      <w:tr>
+        <w:tc>
+          <w:tcPr>
+            <w:tcW w:type="dxa" w:w="4320"/>
+          </w:tcPr>
+          <w:p>
+            <w:r>
+              <w:t>9-sep</w:t>
+            </w:r>
+          </w:p>
+        </w:tc>
+        <w:tc>
+          <w:tcPr>
+            <w:tcW w:type="dxa" w:w="4320"/>
+          </w:tcPr>
+          <w:p>
+            <w:r>
+              <w:t xml:space="preserve">Bienvenida post-ETC a los nuevos (baile + bizcocho) </w:t>
+            </w:r>
+            <w:r>
+              <w:rPr>
+                <w:i/>
+              </w:rPr>
+              <w:t>(sin formación)</w:t>
+            </w:r>
+          </w:p>
+        </w:tc>
+      </w:tr>
     </w:tbl>
     <w:p/>
     <w:p>
@@ -1738,7 +1766,25 @@
         <w:t>Pequeño Grupo (PG):</w:t>
       </w:r>
       <w:r>
-        <w:t xml:space="preserve"> es el grupo de 6–7 participantes que cada pareja de guías acompaña durante todo el retiro. Cada PG tiene su color, su espacio y sus dos guías fijos — no se mezclan.</w:t>
+        <w:t xml:space="preserve"> es el grupo de participantes que cada pareja de guías acompaña durante todo el retiro. </w:t>
+      </w:r>
+      <w:r>
+        <w:rPr>
+          <w:b/>
+        </w:rPr>
+        <w:t>Son siempre 7 parejas de guías (regla fija: 14 guías).</w:t>
+      </w:r>
+      <w:r>
+        <w:t xml:space="preserve"> Cada PG tiene su color, su espacio y sus dos guías fijos — no se mezclan. Los grupos pueden quedar de </w:t>
+      </w:r>
+      <w:r>
+        <w:rPr>
+          <w:b/>
+        </w:rPr>
+        <w:t>distinto tamaño</w:t>
+      </w:r>
+      <w:r>
+        <w:t xml:space="preserve"> (uno con más participantes que otro), pero el número de parejas no cambia.</w:t>
       </w:r>
     </w:p>
     <w:p>
@@ -1769,7 +1815,16 @@
         <w:t>en pareja</w:t>
       </w:r>
       <w:r>
-        <w:t xml:space="preserve"> (2 guías por PG de 6–7 participantes), combinando estilos y procurando que en cada pareja haya al menos alguien que ya haya servido antes.</w:t>
+        <w:t xml:space="preserve"> (2 guías por PG). </w:t>
+      </w:r>
+      <w:r>
+        <w:rPr>
+          <w:b/>
+        </w:rPr>
+        <w:t>Son 7 parejas — es una regla: no hay más ni menos.</w:t>
+      </w:r>
+      <w:r>
+        <w:t xml:space="preserve"> Combinan estilos y procuran que en cada pareja haya al menos alguien que ya haya servido antes.</w:t>
       </w:r>
     </w:p>
     <w:p>
@@ -1846,6 +1901,29 @@
       </w:pPr>
       <w:r>
         <w:t>3. Las parejas (color-coded)</w:t>
+      </w:r>
+    </w:p>
+    <w:p>
+      <w:pPr>
+        <w:pStyle w:val="ListBullet"/>
+      </w:pPr>
+      <w:r>
+        <w:rPr>
+          <w:b/>
+        </w:rPr>
+        <w:t>Son 7 parejas — regla fija</w:t>
+      </w:r>
+      <w:r>
+        <w:t xml:space="preserve"> (14 guías). El número de parejas </w:t>
+      </w:r>
+      <w:r>
+        <w:rPr>
+          <w:b/>
+        </w:rPr>
+        <w:t>no cambia</w:t>
+      </w:r>
+      <w:r>
+        <w:t>; lo que varía es cuántos participantes lleva cada grupo (uno puede tener más que otro).</w:t>
       </w:r>
     </w:p>
     <w:p>

</xml_diff>